<commit_message>
hotworks firesafety and seminar templates update
</commit_message>
<xml_diff>
--- a/templates/FSED-34F-Hot-Works.docx
+++ b/templates/FSED-34F-Hot-Works.docx
@@ -20,13 +20,13 @@
               <wp:anchor distT="0" distB="0" distL="114300" distR="114300" simplePos="0" relativeHeight="251682816" behindDoc="0" locked="0" layoutInCell="1" allowOverlap="1">
                 <wp:simplePos x="0" y="0"/>
                 <wp:positionH relativeFrom="column">
-                  <wp:posOffset>-12700</wp:posOffset>
+                  <wp:posOffset>-21590</wp:posOffset>
                 </wp:positionH>
                 <wp:positionV relativeFrom="paragraph">
-                  <wp:posOffset>100330</wp:posOffset>
+                  <wp:posOffset>-1010920</wp:posOffset>
                 </wp:positionV>
-                <wp:extent cx="7110095" cy="11398250"/>
-                <wp:effectExtent l="19050" t="19050" r="33655" b="31750"/>
+                <wp:extent cx="7110095" cy="10807700"/>
+                <wp:effectExtent l="28575" t="28575" r="43180" b="41275"/>
                 <wp:wrapNone/>
                 <wp:docPr id="12" name="Rectangle 25"/>
                 <wp:cNvGraphicFramePr/>
@@ -39,7 +39,7 @@
                       <wps:spPr bwMode="auto">
                         <a:xfrm>
                           <a:off x="0" y="0"/>
-                          <a:ext cx="7110374" cy="11398361"/>
+                          <a:ext cx="7110374" cy="10807700"/>
                         </a:xfrm>
                         <a:prstGeom prst="rect">
                           <a:avLst/>
@@ -52,6 +52,15 @@
                           <a:miter lim="800000"/>
                         </a:ln>
                       </wps:spPr>
+                      <wps:txbx>
+                        <w:txbxContent>
+                          <w:p>
+                            <w:pPr>
+                              <w:jc w:val="both"/>
+                            </w:pPr>
+                          </w:p>
+                        </w:txbxContent>
+                      </wps:txbx>
                       <wps:bodyPr rot="0" vert="horz" wrap="square" lIns="91440" tIns="45720" rIns="91440" bIns="45720" anchor="t" anchorCtr="0" upright="1">
                         <a:noAutofit/>
                       </wps:bodyPr>
@@ -63,11 +72,20 @@
           </mc:Choice>
           <mc:Fallback>
             <w:pict>
-              <v:rect id="Rectangle 25" o:spid="_x0000_s1026" o:spt="1" style="position:absolute;left:0pt;margin-left:-1pt;margin-top:7.9pt;height:897.5pt;width:559.85pt;z-index:251682816;mso-width-relative:page;mso-height-relative:page;" filled="f" stroked="t" coordsize="21600,21600" o:gfxdata="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">
+              <v:rect id="Rectangle 25" o:spid="_x0000_s1026" o:spt="1" style="position:absolute;left:0pt;margin-left:-1.7pt;margin-top:-79.6pt;height:851pt;width:559.85pt;z-index:251682816;mso-width-relative:page;mso-height-relative:page;" filled="f" stroked="t" coordsize="21600,21600" o:gfxdata="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">
                 <v:fill on="f" focussize="0,0"/>
                 <v:stroke weight="4.5pt" color="#000000" linestyle="thickThin" miterlimit="8" joinstyle="miter"/>
                 <v:imagedata o:title=""/>
                 <o:lock v:ext="edit" aspectratio="f"/>
+                <v:textbox>
+                  <w:txbxContent>
+                    <w:p>
+                      <w:pPr>
+                        <w:jc w:val="both"/>
+                      </w:pPr>
+                    </w:p>
+                  </w:txbxContent>
+                </v:textbox>
               </v:rect>
             </w:pict>
           </mc:Fallback>
@@ -1440,6 +1458,136 @@
         <mc:AlternateContent>
           <mc:Choice Requires="wps">
             <w:drawing>
+              <wp:anchor distT="0" distB="0" distL="114300" distR="114300" simplePos="0" relativeHeight="251710464" behindDoc="0" locked="0" layoutInCell="1" allowOverlap="1">
+                <wp:simplePos x="0" y="0"/>
+                <wp:positionH relativeFrom="column">
+                  <wp:posOffset>-307975</wp:posOffset>
+                </wp:positionH>
+                <wp:positionV relativeFrom="paragraph">
+                  <wp:posOffset>60325</wp:posOffset>
+                </wp:positionV>
+                <wp:extent cx="3978910" cy="342900"/>
+                <wp:effectExtent l="0" t="0" r="0" b="0"/>
+                <wp:wrapNone/>
+                <wp:docPr id="52" name="Text Box 52"/>
+                <wp:cNvGraphicFramePr/>
+                <a:graphic xmlns:a="http://schemas.openxmlformats.org/drawingml/2006/main">
+                  <a:graphicData uri="http://schemas.microsoft.com/office/word/2010/wordprocessingShape">
+                    <wps:wsp>
+                      <wps:cNvSpPr txBox="1"/>
+                      <wps:spPr>
+                        <a:xfrm>
+                          <a:off x="0" y="0"/>
+                          <a:ext cx="3978910" cy="342900"/>
+                        </a:xfrm>
+                        <a:prstGeom prst="rect">
+                          <a:avLst/>
+                        </a:prstGeom>
+                        <a:noFill/>
+                        <a:ln w="6350">
+                          <a:noFill/>
+                        </a:ln>
+                        <a:effectLst/>
+                      </wps:spPr>
+                      <wps:style>
+                        <a:lnRef idx="0">
+                          <a:schemeClr val="accent1"/>
+                        </a:lnRef>
+                        <a:fillRef idx="0">
+                          <a:schemeClr val="accent1"/>
+                        </a:fillRef>
+                        <a:effectRef idx="0">
+                          <a:schemeClr val="accent1"/>
+                        </a:effectRef>
+                        <a:fontRef idx="minor">
+                          <a:schemeClr val="dk1"/>
+                        </a:fontRef>
+                      </wps:style>
+                      <wps:txbx>
+                        <w:txbxContent>
+                          <w:p>
+                            <w:pPr>
+                              <w:spacing w:after="0" w:line="240" w:lineRule="auto"/>
+                              <w:jc w:val="center"/>
+                              <w:rPr>
+                                <w:rFonts w:hint="default" w:ascii="Arial" w:hAnsi="Arial" w:eastAsia="Times New Roman" w:cs="Arial"/>
+                                <w:color w:val="000000"/>
+                                <w:sz w:val="18"/>
+                                <w:szCs w:val="18"/>
+                                <w:lang w:val="en-US"/>
+                              </w:rPr>
+                            </w:pPr>
+                            <w:r>
+                              <w:rPr>
+                                <w:rFonts w:hint="default" w:ascii="Arial" w:hAnsi="Arial" w:eastAsia="Times New Roman" w:cs="Arial"/>
+                                <w:color w:val="000000"/>
+                                <w:sz w:val="18"/>
+                                <w:szCs w:val="18"/>
+                                <w:lang w:val="en-US"/>
+                              </w:rPr>
+                              <w:t>{OWNER}</w:t>
+                            </w:r>
+                          </w:p>
+                        </w:txbxContent>
+                      </wps:txbx>
+                      <wps:bodyPr rot="0" spcFirstLastPara="0" vertOverflow="overflow" horzOverflow="overflow" vert="horz" wrap="square" lIns="91440" tIns="45720" rIns="91440" bIns="45720" numCol="1" spcCol="0" rtlCol="0" fromWordArt="0" anchor="t" anchorCtr="0" forceAA="0" compatLnSpc="1">
+                        <a:noAutofit/>
+                      </wps:bodyPr>
+                    </wps:wsp>
+                  </a:graphicData>
+                </a:graphic>
+              </wp:anchor>
+            </w:drawing>
+          </mc:Choice>
+          <mc:Fallback>
+            <w:pict>
+              <v:shape id="_x0000_s1026" o:spid="_x0000_s1026" o:spt="202" type="#_x0000_t202" style="position:absolute;left:0pt;margin-left:-24.25pt;margin-top:4.75pt;height:27pt;width:313.3pt;z-index:251710464;mso-width-relative:page;mso-height-relative:page;" filled="f" stroked="f" coordsize="21600,21600" o:gfxdata="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">
+                <v:fill on="f" focussize="0,0"/>
+                <v:stroke on="f" weight="0.5pt"/>
+                <v:imagedata o:title=""/>
+                <o:lock v:ext="edit" aspectratio="f"/>
+                <v:textbox>
+                  <w:txbxContent>
+                    <w:p>
+                      <w:pPr>
+                        <w:spacing w:after="0" w:line="240" w:lineRule="auto"/>
+                        <w:jc w:val="center"/>
+                        <w:rPr>
+                          <w:rFonts w:hint="default" w:ascii="Arial" w:hAnsi="Arial" w:eastAsia="Times New Roman" w:cs="Arial"/>
+                          <w:color w:val="000000"/>
+                          <w:sz w:val="18"/>
+                          <w:szCs w:val="18"/>
+                          <w:lang w:val="en-US"/>
+                        </w:rPr>
+                      </w:pPr>
+                      <w:r>
+                        <w:rPr>
+                          <w:rFonts w:hint="default" w:ascii="Arial" w:hAnsi="Arial" w:eastAsia="Times New Roman" w:cs="Arial"/>
+                          <w:color w:val="000000"/>
+                          <w:sz w:val="18"/>
+                          <w:szCs w:val="18"/>
+                          <w:lang w:val="en-US"/>
+                        </w:rPr>
+                        <w:t>{OWNER}</w:t>
+                      </w:r>
+                    </w:p>
+                  </w:txbxContent>
+                </v:textbox>
+              </v:shape>
+            </w:pict>
+          </mc:Fallback>
+        </mc:AlternateContent>
+      </w:r>
+      <w:r>
+        <w:rPr>
+          <w:rFonts w:ascii="Arial" w:hAnsi="Arial" w:cs="Arial"/>
+          <w:sz w:val="24"/>
+          <w:szCs w:val="24"/>
+          <w:lang w:val="en-US" w:eastAsia="en-US"/>
+        </w:rPr>
+        <mc:AlternateContent>
+          <mc:Choice Requires="wps">
+            <w:drawing>
               <wp:anchor distT="0" distB="0" distL="114300" distR="114300" simplePos="0" relativeHeight="251711488" behindDoc="0" locked="0" layoutInCell="1" allowOverlap="1">
                 <wp:simplePos x="0" y="0"/>
                 <wp:positionH relativeFrom="column">
@@ -1551,136 +1699,6 @@
                           <w:lang w:val="en-US"/>
                         </w:rPr>
                         <w:t>{COMPANY_NAME}</w:t>
-                      </w:r>
-                    </w:p>
-                  </w:txbxContent>
-                </v:textbox>
-              </v:shape>
-            </w:pict>
-          </mc:Fallback>
-        </mc:AlternateContent>
-      </w:r>
-      <w:r>
-        <w:rPr>
-          <w:rFonts w:ascii="Arial" w:hAnsi="Arial" w:cs="Arial"/>
-          <w:sz w:val="24"/>
-          <w:szCs w:val="24"/>
-          <w:lang w:val="en-US" w:eastAsia="en-US"/>
-        </w:rPr>
-        <mc:AlternateContent>
-          <mc:Choice Requires="wps">
-            <w:drawing>
-              <wp:anchor distT="0" distB="0" distL="114300" distR="114300" simplePos="0" relativeHeight="251710464" behindDoc="0" locked="0" layoutInCell="1" allowOverlap="1">
-                <wp:simplePos x="0" y="0"/>
-                <wp:positionH relativeFrom="column">
-                  <wp:posOffset>-860425</wp:posOffset>
-                </wp:positionH>
-                <wp:positionV relativeFrom="paragraph">
-                  <wp:posOffset>79375</wp:posOffset>
-                </wp:positionV>
-                <wp:extent cx="6114415" cy="342900"/>
-                <wp:effectExtent l="0" t="0" r="0" b="0"/>
-                <wp:wrapNone/>
-                <wp:docPr id="52" name="Text Box 52"/>
-                <wp:cNvGraphicFramePr/>
-                <a:graphic xmlns:a="http://schemas.openxmlformats.org/drawingml/2006/main">
-                  <a:graphicData uri="http://schemas.microsoft.com/office/word/2010/wordprocessingShape">
-                    <wps:wsp>
-                      <wps:cNvSpPr txBox="1"/>
-                      <wps:spPr>
-                        <a:xfrm>
-                          <a:off x="0" y="0"/>
-                          <a:ext cx="6114415" cy="342900"/>
-                        </a:xfrm>
-                        <a:prstGeom prst="rect">
-                          <a:avLst/>
-                        </a:prstGeom>
-                        <a:noFill/>
-                        <a:ln w="6350">
-                          <a:noFill/>
-                        </a:ln>
-                        <a:effectLst/>
-                      </wps:spPr>
-                      <wps:style>
-                        <a:lnRef idx="0">
-                          <a:schemeClr val="accent1"/>
-                        </a:lnRef>
-                        <a:fillRef idx="0">
-                          <a:schemeClr val="accent1"/>
-                        </a:fillRef>
-                        <a:effectRef idx="0">
-                          <a:schemeClr val="accent1"/>
-                        </a:effectRef>
-                        <a:fontRef idx="minor">
-                          <a:schemeClr val="dk1"/>
-                        </a:fontRef>
-                      </wps:style>
-                      <wps:txbx>
-                        <w:txbxContent>
-                          <w:p>
-                            <w:pPr>
-                              <w:spacing w:after="0" w:line="240" w:lineRule="auto"/>
-                              <w:jc w:val="center"/>
-                              <w:rPr>
-                                <w:rFonts w:hint="default" w:ascii="Arial" w:hAnsi="Arial" w:eastAsia="Times New Roman" w:cs="Arial"/>
-                                <w:color w:val="000000"/>
-                                <w:sz w:val="18"/>
-                                <w:szCs w:val="18"/>
-                                <w:lang w:val="en-US"/>
-                              </w:rPr>
-                            </w:pPr>
-                            <w:r>
-                              <w:rPr>
-                                <w:rFonts w:hint="default" w:ascii="Arial" w:hAnsi="Arial" w:eastAsia="Times New Roman" w:cs="Arial"/>
-                                <w:color w:val="000000"/>
-                                <w:sz w:val="18"/>
-                                <w:szCs w:val="18"/>
-                                <w:lang w:val="en-US"/>
-                              </w:rPr>
-                              <w:t>{OWNER}</w:t>
-                            </w:r>
-                          </w:p>
-                        </w:txbxContent>
-                      </wps:txbx>
-                      <wps:bodyPr rot="0" spcFirstLastPara="0" vertOverflow="overflow" horzOverflow="overflow" vert="horz" wrap="square" lIns="91440" tIns="45720" rIns="91440" bIns="45720" numCol="1" spcCol="0" rtlCol="0" fromWordArt="0" anchor="t" anchorCtr="0" forceAA="0" compatLnSpc="1">
-                        <a:noAutofit/>
-                      </wps:bodyPr>
-                    </wps:wsp>
-                  </a:graphicData>
-                </a:graphic>
-              </wp:anchor>
-            </w:drawing>
-          </mc:Choice>
-          <mc:Fallback>
-            <w:pict>
-              <v:shape id="_x0000_s1026" o:spid="_x0000_s1026" o:spt="202" type="#_x0000_t202" style="position:absolute;left:0pt;margin-left:-67.75pt;margin-top:6.25pt;height:27pt;width:481.45pt;z-index:251710464;mso-width-relative:page;mso-height-relative:page;" filled="f" stroked="f" coordsize="21600,21600" o:gfxdata="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">
-                <v:fill on="f" focussize="0,0"/>
-                <v:stroke on="f" weight="0.5pt"/>
-                <v:imagedata o:title=""/>
-                <o:lock v:ext="edit" aspectratio="f"/>
-                <v:textbox>
-                  <w:txbxContent>
-                    <w:p>
-                      <w:pPr>
-                        <w:spacing w:after="0" w:line="240" w:lineRule="auto"/>
-                        <w:jc w:val="center"/>
-                        <w:rPr>
-                          <w:rFonts w:hint="default" w:ascii="Arial" w:hAnsi="Arial" w:eastAsia="Times New Roman" w:cs="Arial"/>
-                          <w:color w:val="000000"/>
-                          <w:sz w:val="18"/>
-                          <w:szCs w:val="18"/>
-                          <w:lang w:val="en-US"/>
-                        </w:rPr>
-                      </w:pPr>
-                      <w:r>
-                        <w:rPr>
-                          <w:rFonts w:hint="default" w:ascii="Arial" w:hAnsi="Arial" w:eastAsia="Times New Roman" w:cs="Arial"/>
-                          <w:color w:val="000000"/>
-                          <w:sz w:val="18"/>
-                          <w:szCs w:val="18"/>
-                          <w:lang w:val="en-US"/>
-                        </w:rPr>
-                        <w:t>{OWNER}</w:t>
                       </w:r>
                     </w:p>
                   </w:txbxContent>
@@ -7435,6 +7453,7 @@
         <w:jc w:val="both"/>
         <w:rPr>
           <w:rFonts w:ascii="Arial" w:hAnsi="Arial" w:cs="Arial"/>
+          <w:b/>
           <w:sz w:val="20"/>
           <w:szCs w:val="20"/>
         </w:rPr>
@@ -7465,29 +7484,6 @@
         </w:rPr>
         <w:t xml:space="preserve"> after appropriate proceeding and shall hold the owner and his/her installer/contractor liable to the penalties provided under RA 9514.</w:t>
       </w:r>
-    </w:p>
-    <w:p>
-      <w:pPr>
-        <w:spacing w:after="0" w:line="240" w:lineRule="auto"/>
-        <w:ind w:left="720" w:leftChars="0" w:firstLine="720" w:firstLineChars="0"/>
-        <w:jc w:val="both"/>
-        <w:rPr>
-          <w:rFonts w:ascii="Arial Narrow" w:hAnsi="Arial Narrow" w:cs="Arial"/>
-          <w:sz w:val="10"/>
-          <w:szCs w:val="10"/>
-        </w:rPr>
-      </w:pPr>
-    </w:p>
-    <w:p>
-      <w:pPr>
-        <w:spacing w:after="0" w:line="240" w:lineRule="auto"/>
-        <w:rPr>
-          <w:rFonts w:ascii="Arial" w:hAnsi="Arial" w:cs="Arial"/>
-          <w:b/>
-          <w:sz w:val="20"/>
-          <w:szCs w:val="20"/>
-        </w:rPr>
-      </w:pPr>
     </w:p>
     <w:p>
       <w:pPr>
@@ -7598,6 +7594,75 @@
           <w:szCs w:val="20"/>
         </w:rPr>
       </w:pPr>
+      <w:r>
+        <w:rPr>
+          <w:rFonts w:ascii="Arial" w:hAnsi="Arial" w:cs="Arial"/>
+          <w:sz w:val="24"/>
+          <w:szCs w:val="24"/>
+          <w:lang w:val="en-US" w:eastAsia="en-US"/>
+        </w:rPr>
+        <mc:AlternateContent>
+          <mc:Choice Requires="wps">
+            <w:drawing>
+              <wp:anchor distT="0" distB="0" distL="114300" distR="114300" simplePos="0" relativeHeight="251720704" behindDoc="0" locked="0" layoutInCell="1" allowOverlap="1">
+                <wp:simplePos x="0" y="0"/>
+                <wp:positionH relativeFrom="column">
+                  <wp:posOffset>1243330</wp:posOffset>
+                </wp:positionH>
+                <wp:positionV relativeFrom="paragraph">
+                  <wp:posOffset>147955</wp:posOffset>
+                </wp:positionV>
+                <wp:extent cx="844550" cy="1905"/>
+                <wp:effectExtent l="0" t="0" r="0" b="0"/>
+                <wp:wrapNone/>
+                <wp:docPr id="1694765211" name="Straight Connector 22"/>
+                <wp:cNvGraphicFramePr/>
+                <a:graphic xmlns:a="http://schemas.openxmlformats.org/drawingml/2006/main">
+                  <a:graphicData uri="http://schemas.microsoft.com/office/word/2010/wordprocessingShape">
+                    <wps:wsp>
+                      <wps:cNvCnPr/>
+                      <wps:spPr>
+                        <a:xfrm>
+                          <a:off x="0" y="0"/>
+                          <a:ext cx="844550" cy="1905"/>
+                        </a:xfrm>
+                        <a:prstGeom prst="line">
+                          <a:avLst/>
+                        </a:prstGeom>
+                      </wps:spPr>
+                      <wps:style>
+                        <a:lnRef idx="1">
+                          <a:schemeClr val="dk1"/>
+                        </a:lnRef>
+                        <a:fillRef idx="0">
+                          <a:schemeClr val="dk1"/>
+                        </a:fillRef>
+                        <a:effectRef idx="0">
+                          <a:schemeClr val="dk1"/>
+                        </a:effectRef>
+                        <a:fontRef idx="minor">
+                          <a:schemeClr val="tx1"/>
+                        </a:fontRef>
+                      </wps:style>
+                      <wps:bodyPr/>
+                    </wps:wsp>
+                  </a:graphicData>
+                </a:graphic>
+              </wp:anchor>
+            </w:drawing>
+          </mc:Choice>
+          <mc:Fallback>
+            <w:pict>
+              <v:line id="Straight Connector 22" o:spid="_x0000_s1026" o:spt="20" style="position:absolute;left:0pt;margin-left:97.9pt;margin-top:11.65pt;height:0.15pt;width:66.5pt;z-index:251720704;mso-width-relative:page;mso-height-relative:page;" filled="f" stroked="t" coordsize="21600,21600" o:gfxdata="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">
+                <v:fill on="f" focussize="0,0"/>
+                <v:stroke color="#000000 [3200]" joinstyle="round"/>
+                <v:imagedata o:title=""/>
+                <o:lock v:ext="edit" aspectratio="f"/>
+              </v:line>
+            </w:pict>
+          </mc:Fallback>
+        </mc:AlternateContent>
+      </w:r>
       <w:r>
         <w:rPr>
           <w:rFonts w:ascii="Arial" w:hAnsi="Arial" w:cs="Arial"/>
@@ -7893,6 +7958,92 @@
       <w:r>
         <w:rPr>
           <w:rFonts w:ascii="Arial" w:hAnsi="Arial" w:cs="Arial"/>
+          <w:sz w:val="20"/>
+          <w:szCs w:val="20"/>
+        </w:rPr>
+        <w:t xml:space="preserve">Amount Paid: </w:t>
+      </w:r>
+      <w:r>
+        <w:rPr>
+          <w:rFonts w:ascii="Helvetica" w:hAnsi="Helvetica" w:eastAsia="Helvetica" w:cs="Helvetica"/>
+          <w:b w:val="0"/>
+          <w:bCs w:val="0"/>
+          <w:i w:val="0"/>
+          <w:iCs w:val="0"/>
+          <w:caps w:val="0"/>
+          <w:color w:val="000000" w:themeColor="text1"/>
+          <w:spacing w:val="0"/>
+          <w:sz w:val="22"/>
+          <w:szCs w:val="22"/>
+          <w:shd w:val="clear" w:fill="FFFFFF"/>
+          <w14:textFill>
+            <w14:solidFill>
+              <w14:schemeClr w14:val="tx1"/>
+            </w14:solidFill>
+          </w14:textFill>
+        </w:rPr>
+        <w:t>₱</w:t>
+      </w:r>
+      <w:r>
+        <w:rPr>
+          <w:rFonts w:hint="default" w:ascii="Helvetica" w:hAnsi="Helvetica" w:eastAsia="Helvetica" w:cs="Helvetica"/>
+          <w:b w:val="0"/>
+          <w:bCs w:val="0"/>
+          <w:i w:val="0"/>
+          <w:iCs w:val="0"/>
+          <w:caps w:val="0"/>
+          <w:color w:val="000000" w:themeColor="text1"/>
+          <w:spacing w:val="0"/>
+          <w:sz w:val="22"/>
+          <w:szCs w:val="22"/>
+          <w:shd w:val="clear" w:fill="FFFFFF"/>
+          <w:lang w:val="en-US"/>
+          <w14:textFill>
+            <w14:solidFill>
+              <w14:schemeClr w14:val="tx1"/>
+            </w14:solidFill>
+          </w14:textFill>
+        </w:rPr>
+        <w:t xml:space="preserve"> {OR_AMOUNT}</w:t>
+      </w:r>
+      <w:r>
+        <w:rPr>
+          <w:rFonts w:ascii="Arial" w:hAnsi="Arial" w:cs="Arial"/>
+          <w:sz w:val="20"/>
+          <w:szCs w:val="20"/>
+        </w:rPr>
+        <w:tab/>
+      </w:r>
+      <w:r>
+        <w:rPr>
+          <w:rFonts w:ascii="Arial" w:hAnsi="Arial" w:cs="Arial"/>
+          <w:sz w:val="20"/>
+          <w:szCs w:val="20"/>
+        </w:rPr>
+        <w:tab/>
+      </w:r>
+      <w:r>
+        <w:rPr>
+          <w:rFonts w:ascii="Arial" w:hAnsi="Arial" w:cs="Arial"/>
+          <w:sz w:val="20"/>
+          <w:szCs w:val="20"/>
+        </w:rPr>
+        <w:t xml:space="preserve"> </w:t>
+      </w:r>
+    </w:p>
+    <w:p>
+      <w:pPr>
+        <w:spacing w:after="0" w:line="240" w:lineRule="auto"/>
+        <w:ind w:firstLine="720" w:firstLineChars="0"/>
+        <w:rPr>
+          <w:rFonts w:ascii="Arial" w:hAnsi="Arial" w:cs="Arial"/>
+          <w:sz w:val="20"/>
+          <w:szCs w:val="20"/>
+        </w:rPr>
+      </w:pPr>
+      <w:r>
+        <w:rPr>
+          <w:rFonts w:ascii="Arial" w:hAnsi="Arial" w:cs="Arial"/>
           <w:sz w:val="24"/>
           <w:szCs w:val="24"/>
           <w:lang w:val="en-US" w:eastAsia="en-US"/>
@@ -7900,18 +8051,18 @@
         <mc:AlternateContent>
           <mc:Choice Requires="wps">
             <w:drawing>
-              <wp:anchor distT="0" distB="0" distL="114300" distR="114300" simplePos="0" relativeHeight="251720704" behindDoc="0" locked="0" layoutInCell="1" allowOverlap="1">
+              <wp:anchor distT="0" distB="0" distL="114300" distR="114300" simplePos="0" relativeHeight="251721728" behindDoc="0" locked="0" layoutInCell="1" allowOverlap="1">
                 <wp:simplePos x="0" y="0"/>
                 <wp:positionH relativeFrom="column">
-                  <wp:posOffset>781050</wp:posOffset>
+                  <wp:posOffset>1258570</wp:posOffset>
                 </wp:positionH>
                 <wp:positionV relativeFrom="paragraph">
-                  <wp:posOffset>147955</wp:posOffset>
+                  <wp:posOffset>146050</wp:posOffset>
                 </wp:positionV>
-                <wp:extent cx="844550" cy="1905"/>
+                <wp:extent cx="945515" cy="5715"/>
                 <wp:effectExtent l="0" t="0" r="0" b="0"/>
                 <wp:wrapNone/>
-                <wp:docPr id="1694765211" name="Straight Connector 22"/>
+                <wp:docPr id="1094408323" name="Straight Connector 22"/>
                 <wp:cNvGraphicFramePr/>
                 <a:graphic xmlns:a="http://schemas.openxmlformats.org/drawingml/2006/main">
                   <a:graphicData uri="http://schemas.microsoft.com/office/word/2010/wordprocessingShape">
@@ -7920,7 +8071,7 @@
                       <wps:spPr>
                         <a:xfrm>
                           <a:off x="0" y="0"/>
-                          <a:ext cx="844550" cy="1905"/>
+                          <a:ext cx="945515" cy="5715"/>
                         </a:xfrm>
                         <a:prstGeom prst="line">
                           <a:avLst/>
@@ -7949,7 +8100,7 @@
           </mc:Choice>
           <mc:Fallback>
             <w:pict>
-              <v:line id="Straight Connector 22" o:spid="_x0000_s1026" o:spt="20" style="position:absolute;left:0pt;margin-left:61.5pt;margin-top:11.65pt;height:0.15pt;width:66.5pt;z-index:251720704;mso-width-relative:page;mso-height-relative:page;" filled="f" stroked="t" coordsize="21600,21600" o:gfxdata="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">
+              <v:line id="Straight Connector 22" o:spid="_x0000_s1026" o:spt="20" style="position:absolute;left:0pt;margin-left:99.1pt;margin-top:11.5pt;height:0.45pt;width:74.45pt;z-index:251721728;mso-width-relative:page;mso-height-relative:page;" filled="f" stroked="t" coordsize="21600,21600" o:gfxdata="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">
                 <v:fill on="f" focussize="0,0"/>
                 <v:stroke color="#000000 [3200]" joinstyle="round"/>
                 <v:imagedata o:title=""/>
@@ -7959,92 +8110,6 @@
           </mc:Fallback>
         </mc:AlternateContent>
       </w:r>
-      <w:r>
-        <w:rPr>
-          <w:rFonts w:ascii="Arial" w:hAnsi="Arial" w:cs="Arial"/>
-          <w:sz w:val="20"/>
-          <w:szCs w:val="20"/>
-        </w:rPr>
-        <w:t xml:space="preserve">Amount Paid: </w:t>
-      </w:r>
-      <w:r>
-        <w:rPr>
-          <w:rFonts w:ascii="Helvetica" w:hAnsi="Helvetica" w:eastAsia="Helvetica" w:cs="Helvetica"/>
-          <w:b w:val="0"/>
-          <w:bCs w:val="0"/>
-          <w:i w:val="0"/>
-          <w:iCs w:val="0"/>
-          <w:caps w:val="0"/>
-          <w:color w:val="000000" w:themeColor="text1"/>
-          <w:spacing w:val="0"/>
-          <w:sz w:val="22"/>
-          <w:szCs w:val="22"/>
-          <w:shd w:val="clear" w:fill="FFFFFF"/>
-          <w14:textFill>
-            <w14:solidFill>
-              <w14:schemeClr w14:val="tx1"/>
-            </w14:solidFill>
-          </w14:textFill>
-        </w:rPr>
-        <w:t>₱</w:t>
-      </w:r>
-      <w:r>
-        <w:rPr>
-          <w:rFonts w:hint="default" w:ascii="Helvetica" w:hAnsi="Helvetica" w:eastAsia="Helvetica" w:cs="Helvetica"/>
-          <w:b w:val="0"/>
-          <w:bCs w:val="0"/>
-          <w:i w:val="0"/>
-          <w:iCs w:val="0"/>
-          <w:caps w:val="0"/>
-          <w:color w:val="000000" w:themeColor="text1"/>
-          <w:spacing w:val="0"/>
-          <w:sz w:val="22"/>
-          <w:szCs w:val="22"/>
-          <w:shd w:val="clear" w:fill="FFFFFF"/>
-          <w:lang w:val="en-US"/>
-          <w14:textFill>
-            <w14:solidFill>
-              <w14:schemeClr w14:val="tx1"/>
-            </w14:solidFill>
-          </w14:textFill>
-        </w:rPr>
-        <w:t xml:space="preserve"> {OR_AMOUNT}</w:t>
-      </w:r>
-      <w:r>
-        <w:rPr>
-          <w:rFonts w:ascii="Arial" w:hAnsi="Arial" w:cs="Arial"/>
-          <w:sz w:val="20"/>
-          <w:szCs w:val="20"/>
-        </w:rPr>
-        <w:tab/>
-      </w:r>
-      <w:r>
-        <w:rPr>
-          <w:rFonts w:ascii="Arial" w:hAnsi="Arial" w:cs="Arial"/>
-          <w:sz w:val="20"/>
-          <w:szCs w:val="20"/>
-        </w:rPr>
-        <w:tab/>
-      </w:r>
-      <w:r>
-        <w:rPr>
-          <w:rFonts w:ascii="Arial" w:hAnsi="Arial" w:cs="Arial"/>
-          <w:sz w:val="20"/>
-          <w:szCs w:val="20"/>
-        </w:rPr>
-        <w:t xml:space="preserve"> </w:t>
-      </w:r>
-    </w:p>
-    <w:p>
-      <w:pPr>
-        <w:spacing w:after="0" w:line="240" w:lineRule="auto"/>
-        <w:ind w:firstLine="720" w:firstLineChars="0"/>
-        <w:rPr>
-          <w:rFonts w:ascii="Arial" w:hAnsi="Arial" w:cs="Arial"/>
-          <w:sz w:val="20"/>
-          <w:szCs w:val="20"/>
-        </w:rPr>
-      </w:pPr>
       <w:r>
         <w:rPr>
           <w:rFonts w:ascii="Arial" w:hAnsi="Arial" w:cs="Arial"/>
@@ -8117,79 +8182,10 @@
       <w:r>
         <w:rPr>
           <w:rFonts w:ascii="Arial" w:hAnsi="Arial" w:cs="Arial"/>
-          <w:sz w:val="24"/>
-          <w:szCs w:val="24"/>
-          <w:lang w:val="en-US" w:eastAsia="en-US"/>
-        </w:rPr>
-        <mc:AlternateContent>
-          <mc:Choice Requires="wps">
-            <w:drawing>
-              <wp:anchor distT="0" distB="0" distL="114300" distR="114300" simplePos="0" relativeHeight="251721728" behindDoc="0" locked="0" layoutInCell="1" allowOverlap="1">
-                <wp:simplePos x="0" y="0"/>
-                <wp:positionH relativeFrom="column">
-                  <wp:posOffset>781050</wp:posOffset>
-                </wp:positionH>
-                <wp:positionV relativeFrom="paragraph">
-                  <wp:posOffset>146050</wp:posOffset>
-                </wp:positionV>
-                <wp:extent cx="945515" cy="5715"/>
-                <wp:effectExtent l="0" t="0" r="0" b="0"/>
-                <wp:wrapNone/>
-                <wp:docPr id="1094408323" name="Straight Connector 22"/>
-                <wp:cNvGraphicFramePr/>
-                <a:graphic xmlns:a="http://schemas.openxmlformats.org/drawingml/2006/main">
-                  <a:graphicData uri="http://schemas.microsoft.com/office/word/2010/wordprocessingShape">
-                    <wps:wsp>
-                      <wps:cNvCnPr/>
-                      <wps:spPr>
-                        <a:xfrm>
-                          <a:off x="0" y="0"/>
-                          <a:ext cx="945515" cy="5715"/>
-                        </a:xfrm>
-                        <a:prstGeom prst="line">
-                          <a:avLst/>
-                        </a:prstGeom>
-                      </wps:spPr>
-                      <wps:style>
-                        <a:lnRef idx="1">
-                          <a:schemeClr val="dk1"/>
-                        </a:lnRef>
-                        <a:fillRef idx="0">
-                          <a:schemeClr val="dk1"/>
-                        </a:fillRef>
-                        <a:effectRef idx="0">
-                          <a:schemeClr val="dk1"/>
-                        </a:effectRef>
-                        <a:fontRef idx="minor">
-                          <a:schemeClr val="tx1"/>
-                        </a:fontRef>
-                      </wps:style>
-                      <wps:bodyPr/>
-                    </wps:wsp>
-                  </a:graphicData>
-                </a:graphic>
-              </wp:anchor>
-            </w:drawing>
-          </mc:Choice>
-          <mc:Fallback>
-            <w:pict>
-              <v:line id="Straight Connector 22" o:spid="_x0000_s1026" o:spt="20" style="position:absolute;left:0pt;margin-left:61.5pt;margin-top:11.5pt;height:0.45pt;width:74.45pt;z-index:251721728;mso-width-relative:page;mso-height-relative:page;" filled="f" stroked="t" coordsize="21600,21600" o:gfxdata="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">
-                <v:fill on="f" focussize="0,0"/>
-                <v:stroke color="#000000 [3200]" joinstyle="round"/>
-                <v:imagedata o:title=""/>
-                <o:lock v:ext="edit" aspectratio="f"/>
-              </v:line>
-            </w:pict>
-          </mc:Fallback>
-        </mc:AlternateContent>
-      </w:r>
-      <w:r>
-        <w:rPr>
-          <w:rFonts w:ascii="Arial" w:hAnsi="Arial" w:cs="Arial"/>
           <w:sz w:val="20"/>
           <w:szCs w:val="20"/>
         </w:rPr>
-        <w:t xml:space="preserve">O.R. Number:   </w:t>
+        <w:t xml:space="preserve">O.R. Number: </w:t>
       </w:r>
       <w:r>
         <w:rPr>
@@ -8282,7 +8278,7 @@
           <w:sz w:val="20"/>
           <w:szCs w:val="20"/>
         </w:rPr>
-        <w:t xml:space="preserve">Date: </w:t>
+        <w:t>Date:</w:t>
       </w:r>
       <w:r>
         <w:rPr>
@@ -8581,8 +8577,6 @@
         </w:rPr>
         <w:tab/>
       </w:r>
-      <w:bookmarkStart w:id="0" w:name="_GoBack"/>
-      <w:bookmarkEnd w:id="0"/>
       <w:r>
         <w:rPr>
           <w:rFonts w:ascii="Arial Narrow" w:hAnsi="Arial Narrow" w:cs="Arial"/>
@@ -9321,6 +9315,17 @@
         </w:rPr>
         <w:t>“FIRE SAFETY IS OUR MAIN CONCERN”</w:t>
       </w:r>
+    </w:p>
+    <w:p>
+      <w:pPr>
+        <w:spacing w:after="0" w:line="240" w:lineRule="auto"/>
+        <w:rPr>
+          <w:rFonts w:ascii="Arial" w:hAnsi="Arial" w:cs="Arial"/>
+          <w:b/>
+          <w:sz w:val="20"/>
+          <w:szCs w:val="20"/>
+        </w:rPr>
+      </w:pPr>
     </w:p>
     <w:p>
       <w:pPr>

</xml_diff>